<commit_message>
Completed the RTM v1.0 and got sign off from Northwind
</commit_message>
<xml_diff>
--- a/docs/project-management/02_Business_Requirements/BRDv1-Northwind-Outdoors-03082026.docx
+++ b/docs/project-management/02_Business_Requirements/BRDv1-Northwind-Outdoors-03082026.docx
@@ -9,7 +9,7 @@
           <w:lang w:val="en-US"/>
         </w:rPr>
       </w:pPr>
-      <w:bookmarkStart w:id="0" w:name="_Toc236778355"/>
+      <w:bookmarkStart w:id="0" w:name="_Toc237516073"/>
       <w:r>
         <w:rPr>
           <w:lang w:val="en-US"/>
@@ -576,7 +576,7 @@
           <w:r>
             <w:fldChar w:fldCharType="separate"/>
           </w:r>
-          <w:hyperlink w:anchor="_Toc236778355" w:history="1">
+          <w:hyperlink w:anchor="_Toc237516073" w:history="1">
             <w:r>
               <w:rPr>
                 <w:rStyle w:val="Hyperlink"/>
@@ -604,7 +604,7 @@
                 <w:noProof/>
                 <w:webHidden/>
               </w:rPr>
-              <w:instrText xml:space="preserve"> PAGEREF _Toc236778355 \h </w:instrText>
+              <w:instrText xml:space="preserve"> PAGEREF _Toc237516073 \h </w:instrText>
             </w:r>
             <w:r>
               <w:rPr>
@@ -650,7 +650,7 @@
               <w:lang w:eastAsia="en-GB"/>
             </w:rPr>
           </w:pPr>
-          <w:hyperlink w:anchor="_Toc236778356" w:history="1">
+          <w:hyperlink w:anchor="_Toc237516074" w:history="1">
             <w:r>
               <w:rPr>
                 <w:rStyle w:val="Hyperlink"/>
@@ -678,7 +678,7 @@
                 <w:noProof/>
                 <w:webHidden/>
               </w:rPr>
-              <w:instrText xml:space="preserve"> PAGEREF _Toc236778356 \h </w:instrText>
+              <w:instrText xml:space="preserve"> PAGEREF _Toc237516074 \h </w:instrText>
             </w:r>
             <w:r>
               <w:rPr>
@@ -724,7 +724,7 @@
               <w:lang w:eastAsia="en-GB"/>
             </w:rPr>
           </w:pPr>
-          <w:hyperlink w:anchor="_Toc236778357" w:history="1">
+          <w:hyperlink w:anchor="_Toc237516075" w:history="1">
             <w:r>
               <w:rPr>
                 <w:rStyle w:val="Hyperlink"/>
@@ -752,7 +752,7 @@
                 <w:noProof/>
                 <w:webHidden/>
               </w:rPr>
-              <w:instrText xml:space="preserve"> PAGEREF _Toc236778357 \h </w:instrText>
+              <w:instrText xml:space="preserve"> PAGEREF _Toc237516075 \h </w:instrText>
             </w:r>
             <w:r>
               <w:rPr>
@@ -798,7 +798,7 @@
               <w:lang w:eastAsia="en-GB"/>
             </w:rPr>
           </w:pPr>
-          <w:hyperlink w:anchor="_Toc236778358" w:history="1">
+          <w:hyperlink w:anchor="_Toc237516076" w:history="1">
             <w:r>
               <w:rPr>
                 <w:rStyle w:val="Hyperlink"/>
@@ -826,7 +826,7 @@
                 <w:noProof/>
                 <w:webHidden/>
               </w:rPr>
-              <w:instrText xml:space="preserve"> PAGEREF _Toc236778358 \h </w:instrText>
+              <w:instrText xml:space="preserve"> PAGEREF _Toc237516076 \h </w:instrText>
             </w:r>
             <w:r>
               <w:rPr>
@@ -872,7 +872,7 @@
               <w:lang w:eastAsia="en-GB"/>
             </w:rPr>
           </w:pPr>
-          <w:hyperlink w:anchor="_Toc236778359" w:history="1">
+          <w:hyperlink w:anchor="_Toc237516077" w:history="1">
             <w:r>
               <w:rPr>
                 <w:rStyle w:val="Hyperlink"/>
@@ -899,7 +899,7 @@
                 <w:noProof/>
                 <w:webHidden/>
               </w:rPr>
-              <w:instrText xml:space="preserve"> PAGEREF _Toc236778359 \h </w:instrText>
+              <w:instrText xml:space="preserve"> PAGEREF _Toc237516077 \h </w:instrText>
             </w:r>
             <w:r>
               <w:rPr>
@@ -945,7 +945,7 @@
               <w:lang w:eastAsia="en-GB"/>
             </w:rPr>
           </w:pPr>
-          <w:hyperlink w:anchor="_Toc236778360" w:history="1">
+          <w:hyperlink w:anchor="_Toc237516078" w:history="1">
             <w:r>
               <w:rPr>
                 <w:rStyle w:val="Hyperlink"/>
@@ -972,7 +972,7 @@
                 <w:noProof/>
                 <w:webHidden/>
               </w:rPr>
-              <w:instrText xml:space="preserve"> PAGEREF _Toc236778360 \h </w:instrText>
+              <w:instrText xml:space="preserve"> PAGEREF _Toc237516078 \h </w:instrText>
             </w:r>
             <w:r>
               <w:rPr>
@@ -992,7 +992,7 @@
                 <w:noProof/>
                 <w:webHidden/>
               </w:rPr>
-              <w:t>6</w:t>
+              <w:t>7</w:t>
             </w:r>
             <w:r>
               <w:rPr>
@@ -1018,7 +1018,7 @@
               <w:lang w:eastAsia="en-GB"/>
             </w:rPr>
           </w:pPr>
-          <w:hyperlink w:anchor="_Toc236778361" w:history="1">
+          <w:hyperlink w:anchor="_Toc237516079" w:history="1">
             <w:r>
               <w:rPr>
                 <w:rStyle w:val="Hyperlink"/>
@@ -1045,7 +1045,7 @@
                 <w:noProof/>
                 <w:webHidden/>
               </w:rPr>
-              <w:instrText xml:space="preserve"> PAGEREF _Toc236778361 \h </w:instrText>
+              <w:instrText xml:space="preserve"> PAGEREF _Toc237516079 \h </w:instrText>
             </w:r>
             <w:r>
               <w:rPr>
@@ -1065,7 +1065,7 @@
                 <w:noProof/>
                 <w:webHidden/>
               </w:rPr>
-              <w:t>7</w:t>
+              <w:t>9</w:t>
             </w:r>
             <w:r>
               <w:rPr>
@@ -1091,7 +1091,7 @@
               <w:lang w:eastAsia="en-GB"/>
             </w:rPr>
           </w:pPr>
-          <w:hyperlink w:anchor="_Toc236778362" w:history="1">
+          <w:hyperlink w:anchor="_Toc237516080" w:history="1">
             <w:r>
               <w:rPr>
                 <w:rStyle w:val="Hyperlink"/>
@@ -1118,7 +1118,7 @@
                 <w:noProof/>
                 <w:webHidden/>
               </w:rPr>
-              <w:instrText xml:space="preserve"> PAGEREF _Toc236778362 \h </w:instrText>
+              <w:instrText xml:space="preserve"> PAGEREF _Toc237516080 \h </w:instrText>
             </w:r>
             <w:r>
               <w:rPr>
@@ -1138,7 +1138,7 @@
                 <w:noProof/>
                 <w:webHidden/>
               </w:rPr>
-              <w:t>7</w:t>
+              <w:t>9</w:t>
             </w:r>
             <w:r>
               <w:rPr>
@@ -1164,7 +1164,7 @@
               <w:lang w:eastAsia="en-GB"/>
             </w:rPr>
           </w:pPr>
-          <w:hyperlink w:anchor="_Toc236778363" w:history="1">
+          <w:hyperlink w:anchor="_Toc237516081" w:history="1">
             <w:r>
               <w:rPr>
                 <w:rStyle w:val="Hyperlink"/>
@@ -1191,7 +1191,7 @@
                 <w:noProof/>
                 <w:webHidden/>
               </w:rPr>
-              <w:instrText xml:space="preserve"> PAGEREF _Toc236778363 \h </w:instrText>
+              <w:instrText xml:space="preserve"> PAGEREF _Toc237516081 \h </w:instrText>
             </w:r>
             <w:r>
               <w:rPr>
@@ -1211,7 +1211,7 @@
                 <w:noProof/>
                 <w:webHidden/>
               </w:rPr>
-              <w:t>7</w:t>
+              <w:t>10</w:t>
             </w:r>
             <w:r>
               <w:rPr>
@@ -1237,7 +1237,7 @@
               <w:lang w:eastAsia="en-GB"/>
             </w:rPr>
           </w:pPr>
-          <w:hyperlink w:anchor="_Toc236778364" w:history="1">
+          <w:hyperlink w:anchor="_Toc237516082" w:history="1">
             <w:r>
               <w:rPr>
                 <w:rStyle w:val="Hyperlink"/>
@@ -1264,7 +1264,7 @@
                 <w:noProof/>
                 <w:webHidden/>
               </w:rPr>
-              <w:instrText xml:space="preserve"> PAGEREF _Toc236778364 \h </w:instrText>
+              <w:instrText xml:space="preserve"> PAGEREF _Toc237516082 \h </w:instrText>
             </w:r>
             <w:r>
               <w:rPr>
@@ -1284,7 +1284,7 @@
                 <w:noProof/>
                 <w:webHidden/>
               </w:rPr>
-              <w:t>8</w:t>
+              <w:t>11</w:t>
             </w:r>
             <w:r>
               <w:rPr>
@@ -1310,13 +1310,13 @@
               <w:lang w:eastAsia="en-GB"/>
             </w:rPr>
           </w:pPr>
-          <w:hyperlink w:anchor="_Toc236778365" w:history="1">
+          <w:hyperlink w:anchor="_Toc237516083" w:history="1">
             <w:r>
               <w:rPr>
                 <w:rStyle w:val="Hyperlink"/>
                 <w:noProof/>
               </w:rPr>
-              <w:t>5.1 BD-001 – Improve Operational Efficiency</w:t>
+              <w:t>5.1 BD-001 – Improve Operational Efficiency and Management</w:t>
             </w:r>
             <w:r>
               <w:rPr>
@@ -1337,7 +1337,7 @@
                 <w:noProof/>
                 <w:webHidden/>
               </w:rPr>
-              <w:instrText xml:space="preserve"> PAGEREF _Toc236778365 \h </w:instrText>
+              <w:instrText xml:space="preserve"> PAGEREF _Toc237516083 \h </w:instrText>
             </w:r>
             <w:r>
               <w:rPr>
@@ -1357,7 +1357,7 @@
                 <w:noProof/>
                 <w:webHidden/>
               </w:rPr>
-              <w:t>8</w:t>
+              <w:t>11</w:t>
             </w:r>
             <w:r>
               <w:rPr>
@@ -1383,7 +1383,7 @@
               <w:lang w:eastAsia="en-GB"/>
             </w:rPr>
           </w:pPr>
-          <w:hyperlink w:anchor="_Toc236778366" w:history="1">
+          <w:hyperlink w:anchor="_Toc237516084" w:history="1">
             <w:r>
               <w:rPr>
                 <w:rStyle w:val="Hyperlink"/>
@@ -1410,7 +1410,7 @@
                 <w:noProof/>
                 <w:webHidden/>
               </w:rPr>
-              <w:instrText xml:space="preserve"> PAGEREF _Toc236778366 \h </w:instrText>
+              <w:instrText xml:space="preserve"> PAGEREF _Toc237516084 \h </w:instrText>
             </w:r>
             <w:r>
               <w:rPr>
@@ -1430,7 +1430,7 @@
                 <w:noProof/>
                 <w:webHidden/>
               </w:rPr>
-              <w:t>8</w:t>
+              <w:t>11</w:t>
             </w:r>
             <w:r>
               <w:rPr>
@@ -1456,7 +1456,7 @@
               <w:lang w:eastAsia="en-GB"/>
             </w:rPr>
           </w:pPr>
-          <w:hyperlink w:anchor="_Toc236778367" w:history="1">
+          <w:hyperlink w:anchor="_Toc237516085" w:history="1">
             <w:r>
               <w:rPr>
                 <w:rStyle w:val="Hyperlink"/>
@@ -1483,7 +1483,7 @@
                 <w:noProof/>
                 <w:webHidden/>
               </w:rPr>
-              <w:instrText xml:space="preserve"> PAGEREF _Toc236778367 \h </w:instrText>
+              <w:instrText xml:space="preserve"> PAGEREF _Toc237516085 \h </w:instrText>
             </w:r>
             <w:r>
               <w:rPr>
@@ -1503,7 +1503,7 @@
                 <w:noProof/>
                 <w:webHidden/>
               </w:rPr>
-              <w:t>8</w:t>
+              <w:t>12</w:t>
             </w:r>
             <w:r>
               <w:rPr>
@@ -1529,7 +1529,7 @@
               <w:lang w:eastAsia="en-GB"/>
             </w:rPr>
           </w:pPr>
-          <w:hyperlink w:anchor="_Toc236778368" w:history="1">
+          <w:hyperlink w:anchor="_Toc237516086" w:history="1">
             <w:r>
               <w:rPr>
                 <w:rStyle w:val="Hyperlink"/>
@@ -1556,7 +1556,7 @@
                 <w:noProof/>
                 <w:webHidden/>
               </w:rPr>
-              <w:instrText xml:space="preserve"> PAGEREF _Toc236778368 \h </w:instrText>
+              <w:instrText xml:space="preserve"> PAGEREF _Toc237516086 \h </w:instrText>
             </w:r>
             <w:r>
               <w:rPr>
@@ -1576,7 +1576,7 @@
                 <w:noProof/>
                 <w:webHidden/>
               </w:rPr>
-              <w:t>9</w:t>
+              <w:t>13</w:t>
             </w:r>
             <w:r>
               <w:rPr>
@@ -1602,7 +1602,7 @@
               <w:lang w:eastAsia="en-GB"/>
             </w:rPr>
           </w:pPr>
-          <w:hyperlink w:anchor="_Toc236778369" w:history="1">
+          <w:hyperlink w:anchor="_Toc237516087" w:history="1">
             <w:r>
               <w:rPr>
                 <w:rStyle w:val="Hyperlink"/>
@@ -1629,7 +1629,7 @@
                 <w:noProof/>
                 <w:webHidden/>
               </w:rPr>
-              <w:instrText xml:space="preserve"> PAGEREF _Toc236778369 \h </w:instrText>
+              <w:instrText xml:space="preserve"> PAGEREF _Toc237516087 \h </w:instrText>
             </w:r>
             <w:r>
               <w:rPr>
@@ -1649,7 +1649,7 @@
                 <w:noProof/>
                 <w:webHidden/>
               </w:rPr>
-              <w:t>9</w:t>
+              <w:t>13</w:t>
             </w:r>
             <w:r>
               <w:rPr>
@@ -1675,7 +1675,7 @@
               <w:lang w:eastAsia="en-GB"/>
             </w:rPr>
           </w:pPr>
-          <w:hyperlink w:anchor="_Toc236778370" w:history="1">
+          <w:hyperlink w:anchor="_Toc237516088" w:history="1">
             <w:r>
               <w:rPr>
                 <w:rStyle w:val="Hyperlink"/>
@@ -1702,7 +1702,7 @@
                 <w:noProof/>
                 <w:webHidden/>
               </w:rPr>
-              <w:instrText xml:space="preserve"> PAGEREF _Toc236778370 \h </w:instrText>
+              <w:instrText xml:space="preserve"> PAGEREF _Toc237516088 \h </w:instrText>
             </w:r>
             <w:r>
               <w:rPr>
@@ -1722,7 +1722,7 @@
                 <w:noProof/>
                 <w:webHidden/>
               </w:rPr>
-              <w:t>9</w:t>
+              <w:t>13</w:t>
             </w:r>
             <w:r>
               <w:rPr>
@@ -1748,7 +1748,7 @@
               <w:lang w:eastAsia="en-GB"/>
             </w:rPr>
           </w:pPr>
-          <w:hyperlink w:anchor="_Toc236778371" w:history="1">
+          <w:hyperlink w:anchor="_Toc237516089" w:history="1">
             <w:r>
               <w:rPr>
                 <w:rStyle w:val="Hyperlink"/>
@@ -1775,7 +1775,7 @@
                 <w:noProof/>
                 <w:webHidden/>
               </w:rPr>
-              <w:instrText xml:space="preserve"> PAGEREF _Toc236778371 \h </w:instrText>
+              <w:instrText xml:space="preserve"> PAGEREF _Toc237516089 \h </w:instrText>
             </w:r>
             <w:r>
               <w:rPr>
@@ -1795,7 +1795,7 @@
                 <w:noProof/>
                 <w:webHidden/>
               </w:rPr>
-              <w:t>10</w:t>
+              <w:t>15</w:t>
             </w:r>
             <w:r>
               <w:rPr>
@@ -1821,7 +1821,7 @@
               <w:lang w:eastAsia="en-GB"/>
             </w:rPr>
           </w:pPr>
-          <w:hyperlink w:anchor="_Toc236778372" w:history="1">
+          <w:hyperlink w:anchor="_Toc237516090" w:history="1">
             <w:r>
               <w:rPr>
                 <w:rStyle w:val="Hyperlink"/>
@@ -1848,7 +1848,7 @@
                 <w:noProof/>
                 <w:webHidden/>
               </w:rPr>
-              <w:instrText xml:space="preserve"> PAGEREF _Toc236778372 \h </w:instrText>
+              <w:instrText xml:space="preserve"> PAGEREF _Toc237516090 \h </w:instrText>
             </w:r>
             <w:r>
               <w:rPr>
@@ -1868,7 +1868,7 @@
                 <w:noProof/>
                 <w:webHidden/>
               </w:rPr>
-              <w:t>11</w:t>
+              <w:t>17</w:t>
             </w:r>
             <w:r>
               <w:rPr>
@@ -1894,7 +1894,7 @@
               <w:lang w:eastAsia="en-GB"/>
             </w:rPr>
           </w:pPr>
-          <w:hyperlink w:anchor="_Toc236778373" w:history="1">
+          <w:hyperlink w:anchor="_Toc237516091" w:history="1">
             <w:r>
               <w:rPr>
                 <w:rStyle w:val="Hyperlink"/>
@@ -1921,7 +1921,7 @@
                 <w:noProof/>
                 <w:webHidden/>
               </w:rPr>
-              <w:instrText xml:space="preserve"> PAGEREF _Toc236778373 \h </w:instrText>
+              <w:instrText xml:space="preserve"> PAGEREF _Toc237516091 \h </w:instrText>
             </w:r>
             <w:r>
               <w:rPr>
@@ -1941,7 +1941,7 @@
                 <w:noProof/>
                 <w:webHidden/>
               </w:rPr>
-              <w:t>11</w:t>
+              <w:t>17</w:t>
             </w:r>
             <w:r>
               <w:rPr>
@@ -1968,7 +1968,7 @@
               <w:lang w:eastAsia="en-GB"/>
             </w:rPr>
           </w:pPr>
-          <w:hyperlink w:anchor="_Toc236778374" w:history="1">
+          <w:hyperlink w:anchor="_Toc237516092" w:history="1">
             <w:r>
               <w:rPr>
                 <w:rStyle w:val="Hyperlink"/>
@@ -2013,7 +2013,7 @@
                 <w:noProof/>
                 <w:webHidden/>
               </w:rPr>
-              <w:instrText xml:space="preserve"> PAGEREF _Toc236778374 \h </w:instrText>
+              <w:instrText xml:space="preserve"> PAGEREF _Toc237516092 \h </w:instrText>
             </w:r>
             <w:r>
               <w:rPr>
@@ -2033,7 +2033,7 @@
                 <w:noProof/>
                 <w:webHidden/>
               </w:rPr>
-              <w:t>12</w:t>
+              <w:t>18</w:t>
             </w:r>
             <w:r>
               <w:rPr>
@@ -2059,7 +2059,7 @@
               <w:lang w:eastAsia="en-GB"/>
             </w:rPr>
           </w:pPr>
-          <w:hyperlink w:anchor="_Toc236778375" w:history="1">
+          <w:hyperlink w:anchor="_Toc237516093" w:history="1">
             <w:r>
               <w:rPr>
                 <w:rStyle w:val="Hyperlink"/>
@@ -2086,7 +2086,7 @@
                 <w:noProof/>
                 <w:webHidden/>
               </w:rPr>
-              <w:instrText xml:space="preserve"> PAGEREF _Toc236778375 \h </w:instrText>
+              <w:instrText xml:space="preserve"> PAGEREF _Toc237516093 \h </w:instrText>
             </w:r>
             <w:r>
               <w:rPr>
@@ -2106,7 +2106,7 @@
                 <w:noProof/>
                 <w:webHidden/>
               </w:rPr>
-              <w:t>12</w:t>
+              <w:t>20</w:t>
             </w:r>
             <w:r>
               <w:rPr>
@@ -2132,7 +2132,7 @@
               <w:lang w:eastAsia="en-GB"/>
             </w:rPr>
           </w:pPr>
-          <w:hyperlink w:anchor="_Toc236778376" w:history="1">
+          <w:hyperlink w:anchor="_Toc237516094" w:history="1">
             <w:r>
               <w:rPr>
                 <w:rStyle w:val="Hyperlink"/>
@@ -2159,7 +2159,7 @@
                 <w:noProof/>
                 <w:webHidden/>
               </w:rPr>
-              <w:instrText xml:space="preserve"> PAGEREF _Toc236778376 \h </w:instrText>
+              <w:instrText xml:space="preserve"> PAGEREF _Toc237516094 \h </w:instrText>
             </w:r>
             <w:r>
               <w:rPr>
@@ -2179,7 +2179,7 @@
                 <w:noProof/>
                 <w:webHidden/>
               </w:rPr>
-              <w:t>13</w:t>
+              <w:t>22</w:t>
             </w:r>
             <w:r>
               <w:rPr>
@@ -2205,7 +2205,7 @@
               <w:lang w:eastAsia="en-GB"/>
             </w:rPr>
           </w:pPr>
-          <w:hyperlink w:anchor="_Toc236778377" w:history="1">
+          <w:hyperlink w:anchor="_Toc237516095" w:history="1">
             <w:r>
               <w:rPr>
                 <w:rStyle w:val="Hyperlink"/>
@@ -2232,7 +2232,7 @@
                 <w:noProof/>
                 <w:webHidden/>
               </w:rPr>
-              <w:instrText xml:space="preserve"> PAGEREF _Toc236778377 \h </w:instrText>
+              <w:instrText xml:space="preserve"> PAGEREF _Toc237516095 \h </w:instrText>
             </w:r>
             <w:r>
               <w:rPr>
@@ -2252,7 +2252,7 @@
                 <w:noProof/>
                 <w:webHidden/>
               </w:rPr>
-              <w:t>17</w:t>
+              <w:t>28</w:t>
             </w:r>
             <w:r>
               <w:rPr>
@@ -2279,7 +2279,7 @@
               <w:lang w:eastAsia="en-GB"/>
             </w:rPr>
           </w:pPr>
-          <w:hyperlink w:anchor="_Toc236778378" w:history="1">
+          <w:hyperlink w:anchor="_Toc237516096" w:history="1">
             <w:r>
               <w:rPr>
                 <w:rStyle w:val="Hyperlink"/>
@@ -2324,7 +2324,7 @@
                 <w:noProof/>
                 <w:webHidden/>
               </w:rPr>
-              <w:instrText xml:space="preserve"> PAGEREF _Toc236778378 \h </w:instrText>
+              <w:instrText xml:space="preserve"> PAGEREF _Toc237516096 \h </w:instrText>
             </w:r>
             <w:r>
               <w:rPr>
@@ -2344,7 +2344,7 @@
                 <w:noProof/>
                 <w:webHidden/>
               </w:rPr>
-              <w:t>19</w:t>
+              <w:t>31</w:t>
             </w:r>
             <w:r>
               <w:rPr>
@@ -2371,7 +2371,7 @@
               <w:lang w:eastAsia="en-GB"/>
             </w:rPr>
           </w:pPr>
-          <w:hyperlink w:anchor="_Toc236778379" w:history="1">
+          <w:hyperlink w:anchor="_Toc237516097" w:history="1">
             <w:r>
               <w:rPr>
                 <w:rStyle w:val="Hyperlink"/>
@@ -2416,7 +2416,7 @@
                 <w:noProof/>
                 <w:webHidden/>
               </w:rPr>
-              <w:instrText xml:space="preserve"> PAGEREF _Toc236778379 \h </w:instrText>
+              <w:instrText xml:space="preserve"> PAGEREF _Toc237516097 \h </w:instrText>
             </w:r>
             <w:r>
               <w:rPr>
@@ -2436,7 +2436,7 @@
                 <w:noProof/>
                 <w:webHidden/>
               </w:rPr>
-              <w:t>19</w:t>
+              <w:t>32</w:t>
             </w:r>
             <w:r>
               <w:rPr>
@@ -2463,7 +2463,7 @@
               <w:lang w:eastAsia="en-GB"/>
             </w:rPr>
           </w:pPr>
-          <w:hyperlink w:anchor="_Toc236778380" w:history="1">
+          <w:hyperlink w:anchor="_Toc237516098" w:history="1">
             <w:r>
               <w:rPr>
                 <w:rStyle w:val="Hyperlink"/>
@@ -2508,7 +2508,7 @@
                 <w:noProof/>
                 <w:webHidden/>
               </w:rPr>
-              <w:instrText xml:space="preserve"> PAGEREF _Toc236778380 \h </w:instrText>
+              <w:instrText xml:space="preserve"> PAGEREF _Toc237516098 \h </w:instrText>
             </w:r>
             <w:r>
               <w:rPr>
@@ -2528,7 +2528,7 @@
                 <w:noProof/>
                 <w:webHidden/>
               </w:rPr>
-              <w:t>20</w:t>
+              <w:t>33</w:t>
             </w:r>
             <w:r>
               <w:rPr>
@@ -2555,7 +2555,7 @@
               <w:lang w:eastAsia="en-GB"/>
             </w:rPr>
           </w:pPr>
-          <w:hyperlink w:anchor="_Toc236778381" w:history="1">
+          <w:hyperlink w:anchor="_Toc237516099" w:history="1">
             <w:r>
               <w:rPr>
                 <w:rStyle w:val="Hyperlink"/>
@@ -2600,7 +2600,7 @@
                 <w:noProof/>
                 <w:webHidden/>
               </w:rPr>
-              <w:instrText xml:space="preserve"> PAGEREF _Toc236778381 \h </w:instrText>
+              <w:instrText xml:space="preserve"> PAGEREF _Toc237516099 \h </w:instrText>
             </w:r>
             <w:r>
               <w:rPr>
@@ -2620,7 +2620,7 @@
                 <w:noProof/>
                 <w:webHidden/>
               </w:rPr>
-              <w:t>20</w:t>
+              <w:t>34</w:t>
             </w:r>
             <w:r>
               <w:rPr>
@@ -2647,7 +2647,7 @@
               <w:lang w:eastAsia="en-GB"/>
             </w:rPr>
           </w:pPr>
-          <w:hyperlink w:anchor="_Toc236778382" w:history="1">
+          <w:hyperlink w:anchor="_Toc237516100" w:history="1">
             <w:r>
               <w:rPr>
                 <w:rStyle w:val="Hyperlink"/>
@@ -2692,7 +2692,7 @@
                 <w:noProof/>
                 <w:webHidden/>
               </w:rPr>
-              <w:instrText xml:space="preserve"> PAGEREF _Toc236778382 \h </w:instrText>
+              <w:instrText xml:space="preserve"> PAGEREF _Toc237516100 \h </w:instrText>
             </w:r>
             <w:r>
               <w:rPr>
@@ -2712,7 +2712,245 @@
                 <w:noProof/>
                 <w:webHidden/>
               </w:rPr>
-              <w:t>20</w:t>
+              <w:t>35</w:t>
+            </w:r>
+            <w:r>
+              <w:rPr>
+                <w:noProof/>
+                <w:webHidden/>
+              </w:rPr>
+              <w:fldChar w:fldCharType="end"/>
+            </w:r>
+          </w:hyperlink>
+        </w:p>
+        <w:p>
+          <w:pPr>
+            <w:pStyle w:val="TOC2"/>
+            <w:tabs>
+              <w:tab w:val="left" w:pos="960"/>
+              <w:tab w:val="right" w:leader="dot" w:pos="9062"/>
+            </w:tabs>
+            <w:rPr>
+              <w:rFonts w:eastAsiaTheme="minorEastAsia"/>
+              <w:noProof/>
+              <w:kern w:val="2"/>
+              <w:sz w:val="24"/>
+              <w:szCs w:val="24"/>
+              <w:lang w:eastAsia="en-GB"/>
+            </w:rPr>
+          </w:pPr>
+          <w:hyperlink w:anchor="_Toc237516101" w:history="1">
+            <w:r>
+              <w:rPr>
+                <w:rStyle w:val="Hyperlink"/>
+                <w:noProof/>
+              </w:rPr>
+              <w:t>14.</w:t>
+            </w:r>
+            <w:r>
+              <w:rPr>
+                <w:rFonts w:eastAsiaTheme="minorEastAsia"/>
+                <w:noProof/>
+                <w:kern w:val="2"/>
+                <w:sz w:val="24"/>
+                <w:szCs w:val="24"/>
+                <w:lang w:eastAsia="en-GB"/>
+              </w:rPr>
+              <w:tab/>
+            </w:r>
+            <w:r>
+              <w:rPr>
+                <w:rStyle w:val="Hyperlink"/>
+                <w:noProof/>
+              </w:rPr>
+              <w:t>Approval</w:t>
+            </w:r>
+            <w:r>
+              <w:rPr>
+                <w:noProof/>
+                <w:webHidden/>
+              </w:rPr>
+              <w:tab/>
+            </w:r>
+            <w:r>
+              <w:rPr>
+                <w:noProof/>
+                <w:webHidden/>
+              </w:rPr>
+              <w:fldChar w:fldCharType="begin"/>
+            </w:r>
+            <w:r>
+              <w:rPr>
+                <w:noProof/>
+                <w:webHidden/>
+              </w:rPr>
+              <w:instrText xml:space="preserve"> PAGEREF _Toc237516101 \h </w:instrText>
+            </w:r>
+            <w:r>
+              <w:rPr>
+                <w:noProof/>
+                <w:webHidden/>
+              </w:rPr>
+            </w:r>
+            <w:r>
+              <w:rPr>
+                <w:noProof/>
+                <w:webHidden/>
+              </w:rPr>
+              <w:fldChar w:fldCharType="separate"/>
+            </w:r>
+            <w:r>
+              <w:rPr>
+                <w:noProof/>
+                <w:webHidden/>
+              </w:rPr>
+              <w:t>37</w:t>
+            </w:r>
+            <w:r>
+              <w:rPr>
+                <w:noProof/>
+                <w:webHidden/>
+              </w:rPr>
+              <w:fldChar w:fldCharType="end"/>
+            </w:r>
+          </w:hyperlink>
+        </w:p>
+        <w:p>
+          <w:pPr>
+            <w:pStyle w:val="TOC3"/>
+            <w:tabs>
+              <w:tab w:val="right" w:leader="dot" w:pos="9062"/>
+            </w:tabs>
+            <w:rPr>
+              <w:rFonts w:eastAsiaTheme="minorEastAsia"/>
+              <w:noProof/>
+              <w:kern w:val="2"/>
+              <w:sz w:val="24"/>
+              <w:szCs w:val="24"/>
+              <w:lang w:eastAsia="en-GB"/>
+            </w:rPr>
+          </w:pPr>
+          <w:hyperlink w:anchor="_Toc237516102" w:history="1">
+            <w:r>
+              <w:rPr>
+                <w:rStyle w:val="Hyperlink"/>
+                <w:noProof/>
+              </w:rPr>
+              <w:t>Approval Sign-Off</w:t>
+            </w:r>
+            <w:r>
+              <w:rPr>
+                <w:noProof/>
+                <w:webHidden/>
+              </w:rPr>
+              <w:tab/>
+            </w:r>
+            <w:r>
+              <w:rPr>
+                <w:noProof/>
+                <w:webHidden/>
+              </w:rPr>
+              <w:fldChar w:fldCharType="begin"/>
+            </w:r>
+            <w:r>
+              <w:rPr>
+                <w:noProof/>
+                <w:webHidden/>
+              </w:rPr>
+              <w:instrText xml:space="preserve"> PAGEREF _Toc237516102 \h </w:instrText>
+            </w:r>
+            <w:r>
+              <w:rPr>
+                <w:noProof/>
+                <w:webHidden/>
+              </w:rPr>
+            </w:r>
+            <w:r>
+              <w:rPr>
+                <w:noProof/>
+                <w:webHidden/>
+              </w:rPr>
+              <w:fldChar w:fldCharType="separate"/>
+            </w:r>
+            <w:r>
+              <w:rPr>
+                <w:noProof/>
+                <w:webHidden/>
+              </w:rPr>
+              <w:t>37</w:t>
+            </w:r>
+            <w:r>
+              <w:rPr>
+                <w:noProof/>
+                <w:webHidden/>
+              </w:rPr>
+              <w:fldChar w:fldCharType="end"/>
+            </w:r>
+          </w:hyperlink>
+        </w:p>
+        <w:p>
+          <w:pPr>
+            <w:pStyle w:val="TOC3"/>
+            <w:tabs>
+              <w:tab w:val="right" w:leader="dot" w:pos="9062"/>
+            </w:tabs>
+            <w:rPr>
+              <w:rFonts w:eastAsiaTheme="minorEastAsia"/>
+              <w:noProof/>
+              <w:kern w:val="2"/>
+              <w:sz w:val="24"/>
+              <w:szCs w:val="24"/>
+              <w:lang w:eastAsia="en-GB"/>
+            </w:rPr>
+          </w:pPr>
+          <w:hyperlink w:anchor="_Toc237516103" w:history="1">
+            <w:r>
+              <w:rPr>
+                <w:rStyle w:val="Hyperlink"/>
+                <w:noProof/>
+              </w:rPr>
+              <w:t>Baseline</w:t>
+            </w:r>
+            <w:r>
+              <w:rPr>
+                <w:noProof/>
+                <w:webHidden/>
+              </w:rPr>
+              <w:tab/>
+            </w:r>
+            <w:r>
+              <w:rPr>
+                <w:noProof/>
+                <w:webHidden/>
+              </w:rPr>
+              <w:fldChar w:fldCharType="begin"/>
+            </w:r>
+            <w:r>
+              <w:rPr>
+                <w:noProof/>
+                <w:webHidden/>
+              </w:rPr>
+              <w:instrText xml:space="preserve"> PAGEREF _Toc237516103 \h </w:instrText>
+            </w:r>
+            <w:r>
+              <w:rPr>
+                <w:noProof/>
+                <w:webHidden/>
+              </w:rPr>
+            </w:r>
+            <w:r>
+              <w:rPr>
+                <w:noProof/>
+                <w:webHidden/>
+              </w:rPr>
+              <w:fldChar w:fldCharType="separate"/>
+            </w:r>
+            <w:r>
+              <w:rPr>
+                <w:noProof/>
+                <w:webHidden/>
+              </w:rPr>
+              <w:t>37</w:t>
             </w:r>
             <w:r>
               <w:rPr>
@@ -2738,13 +2976,13 @@
               <w:lang w:eastAsia="en-GB"/>
             </w:rPr>
           </w:pPr>
-          <w:hyperlink w:anchor="_Toc236778383" w:history="1">
+          <w:hyperlink w:anchor="_Toc237516104" w:history="1">
             <w:r>
               <w:rPr>
                 <w:rStyle w:val="Hyperlink"/>
                 <w:noProof/>
               </w:rPr>
-              <w:t>14. Approval</w:t>
+              <w:t>Appendix 1 – Glossary</w:t>
             </w:r>
             <w:r>
               <w:rPr>
@@ -2765,7 +3003,7 @@
                 <w:noProof/>
                 <w:webHidden/>
               </w:rPr>
-              <w:instrText xml:space="preserve"> PAGEREF _Toc236778383 \h </w:instrText>
+              <w:instrText xml:space="preserve"> PAGEREF _Toc237516104 \h </w:instrText>
             </w:r>
             <w:r>
               <w:rPr>
@@ -2785,7 +3023,7 @@
                 <w:noProof/>
                 <w:webHidden/>
               </w:rPr>
-              <w:t>21</w:t>
+              <w:t>37</w:t>
             </w:r>
             <w:r>
               <w:rPr>
@@ -2811,13 +3049,13 @@
               <w:lang w:eastAsia="en-GB"/>
             </w:rPr>
           </w:pPr>
-          <w:hyperlink w:anchor="_Toc236778384" w:history="1">
+          <w:hyperlink w:anchor="_Toc237516105" w:history="1">
             <w:r>
               <w:rPr>
                 <w:rStyle w:val="Hyperlink"/>
                 <w:noProof/>
               </w:rPr>
-              <w:t>Appendix 1 – Glossary</w:t>
+              <w:t>Appendix 2 - Priority Table</w:t>
             </w:r>
             <w:r>
               <w:rPr>
@@ -2838,7 +3076,7 @@
                 <w:noProof/>
                 <w:webHidden/>
               </w:rPr>
-              <w:instrText xml:space="preserve"> PAGEREF _Toc236778384 \h </w:instrText>
+              <w:instrText xml:space="preserve"> PAGEREF _Toc237516105 \h </w:instrText>
             </w:r>
             <w:r>
               <w:rPr>
@@ -2858,80 +3096,7 @@
                 <w:noProof/>
                 <w:webHidden/>
               </w:rPr>
-              <w:t>21</w:t>
-            </w:r>
-            <w:r>
-              <w:rPr>
-                <w:noProof/>
-                <w:webHidden/>
-              </w:rPr>
-              <w:fldChar w:fldCharType="end"/>
-            </w:r>
-          </w:hyperlink>
-        </w:p>
-        <w:p>
-          <w:pPr>
-            <w:pStyle w:val="TOC2"/>
-            <w:tabs>
-              <w:tab w:val="right" w:leader="dot" w:pos="9062"/>
-            </w:tabs>
-            <w:rPr>
-              <w:rFonts w:eastAsiaTheme="minorEastAsia"/>
-              <w:noProof/>
-              <w:kern w:val="2"/>
-              <w:sz w:val="24"/>
-              <w:szCs w:val="24"/>
-              <w:lang w:eastAsia="en-GB"/>
-            </w:rPr>
-          </w:pPr>
-          <w:hyperlink w:anchor="_Toc236778385" w:history="1">
-            <w:r>
-              <w:rPr>
-                <w:rStyle w:val="Hyperlink"/>
-                <w:noProof/>
-              </w:rPr>
-              <w:t>Appendix 2 - Priority Table</w:t>
-            </w:r>
-            <w:r>
-              <w:rPr>
-                <w:noProof/>
-                <w:webHidden/>
-              </w:rPr>
-              <w:tab/>
-            </w:r>
-            <w:r>
-              <w:rPr>
-                <w:noProof/>
-                <w:webHidden/>
-              </w:rPr>
-              <w:fldChar w:fldCharType="begin"/>
-            </w:r>
-            <w:r>
-              <w:rPr>
-                <w:noProof/>
-                <w:webHidden/>
-              </w:rPr>
-              <w:instrText xml:space="preserve"> PAGEREF _Toc236778385 \h </w:instrText>
-            </w:r>
-            <w:r>
-              <w:rPr>
-                <w:noProof/>
-                <w:webHidden/>
-              </w:rPr>
-            </w:r>
-            <w:r>
-              <w:rPr>
-                <w:noProof/>
-                <w:webHidden/>
-              </w:rPr>
-              <w:fldChar w:fldCharType="separate"/>
-            </w:r>
-            <w:r>
-              <w:rPr>
-                <w:noProof/>
-                <w:webHidden/>
-              </w:rPr>
-              <w:t>21</w:t>
+              <w:t>38</w:t>
             </w:r>
             <w:r>
               <w:rPr>
@@ -2963,13 +3128,6 @@
     </w:p>
     <w:p>
       <w:pPr>
-        <w:rPr>
-          <w:lang w:val="en-US"/>
-        </w:rPr>
-      </w:pPr>
-    </w:p>
-    <w:p>
-      <w:pPr>
         <w:pStyle w:val="Heading2"/>
         <w:rPr>
           <w:lang w:val="en-US"/>
@@ -2982,7 +3140,7 @@
         <w:br w:type="page"/>
       </w:r>
       <w:bookmarkStart w:id="1" w:name="_Toc174549032"/>
-      <w:bookmarkStart w:id="2" w:name="_Toc236778356"/>
+      <w:bookmarkStart w:id="2" w:name="_Toc237516074"/>
       <w:r>
         <w:rPr>
           <w:lang w:val="en-US"/>
@@ -3001,7 +3159,7 @@
         </w:rPr>
       </w:pPr>
       <w:bookmarkStart w:id="3" w:name="_Toc174549033"/>
-      <w:bookmarkStart w:id="4" w:name="_Toc236778357"/>
+      <w:bookmarkStart w:id="4" w:name="_Toc237516075"/>
       <w:r>
         <w:rPr>
           <w:lang w:val="en-US"/>
@@ -3173,7 +3331,7 @@
         </w:rPr>
       </w:pPr>
       <w:bookmarkStart w:id="5" w:name="_Toc174549034"/>
-      <w:bookmarkStart w:id="6" w:name="_Toc236778358"/>
+      <w:bookmarkStart w:id="6" w:name="_Toc237516076"/>
       <w:r>
         <w:rPr>
           <w:lang w:val="en-US"/>
@@ -3778,7 +3936,7 @@
       <w:pPr>
         <w:pStyle w:val="Heading2"/>
       </w:pPr>
-      <w:bookmarkStart w:id="7" w:name="_Toc236778359"/>
+      <w:bookmarkStart w:id="7" w:name="_Toc237516077"/>
       <w:r>
         <w:lastRenderedPageBreak/>
         <w:t xml:space="preserve">2. </w:t>
@@ -3866,7 +4024,7 @@
       <w:pPr>
         <w:pStyle w:val="Heading2"/>
       </w:pPr>
-      <w:bookmarkStart w:id="8" w:name="_Toc236778360"/>
+      <w:bookmarkStart w:id="8" w:name="_Toc237516078"/>
       <w:r>
         <w:lastRenderedPageBreak/>
         <w:t>3. Project Description</w:t>
@@ -3944,7 +4102,7 @@
       <w:pPr>
         <w:pStyle w:val="Heading2"/>
       </w:pPr>
-      <w:bookmarkStart w:id="9" w:name="_Toc236778361"/>
+      <w:bookmarkStart w:id="9" w:name="_Toc237516079"/>
       <w:r>
         <w:lastRenderedPageBreak/>
         <w:t>4</w:t>
@@ -3958,7 +4116,7 @@
       <w:pPr>
         <w:pStyle w:val="Heading3"/>
       </w:pPr>
-      <w:bookmarkStart w:id="10" w:name="_Toc236778362"/>
+      <w:bookmarkStart w:id="10" w:name="_Toc237516080"/>
       <w:r>
         <w:t>4.1 In Scope</w:t>
       </w:r>
@@ -4232,7 +4390,7 @@
       <w:pPr>
         <w:pStyle w:val="Heading3"/>
       </w:pPr>
-      <w:bookmarkStart w:id="11" w:name="_Toc236778363"/>
+      <w:bookmarkStart w:id="11" w:name="_Toc237516081"/>
       <w:r>
         <w:t xml:space="preserve">4.2 </w:t>
       </w:r>
@@ -4424,7 +4582,7 @@
       <w:pPr>
         <w:pStyle w:val="Heading2"/>
       </w:pPr>
-      <w:bookmarkStart w:id="12" w:name="_Toc236778364"/>
+      <w:bookmarkStart w:id="12" w:name="_Toc237516082"/>
       <w:r>
         <w:lastRenderedPageBreak/>
         <w:t>5. Business Drivers</w:t>
@@ -4435,9 +4593,11 @@
       <w:pPr>
         <w:pStyle w:val="Heading3"/>
       </w:pPr>
+      <w:bookmarkStart w:id="13" w:name="_Toc237516083"/>
       <w:r>
         <w:t>5.1 BD-001 – Improve Operational Efficiency and Management</w:t>
       </w:r>
+      <w:bookmarkEnd w:id="13"/>
     </w:p>
     <w:p>
       <w:r>
@@ -4566,9 +4726,11 @@
       <w:pPr>
         <w:pStyle w:val="Heading3"/>
       </w:pPr>
+      <w:bookmarkStart w:id="14" w:name="_Toc237516084"/>
       <w:r>
         <w:t>5.2 BD-002 – Improve Security, Resilience and Business Continuity</w:t>
       </w:r>
+      <w:bookmarkEnd w:id="14"/>
     </w:p>
     <w:p>
       <w:r>
@@ -4706,9 +4868,11 @@
       <w:pPr>
         <w:pStyle w:val="Heading3"/>
       </w:pPr>
+      <w:bookmarkStart w:id="15" w:name="_Toc237516085"/>
       <w:r>
         <w:t>5.3 BD-003 – Support Future Growth</w:t>
       </w:r>
+      <w:bookmarkEnd w:id="15"/>
     </w:p>
     <w:p>
       <w:r>
@@ -4815,7 +4979,7 @@
       <w:pPr>
         <w:pStyle w:val="Heading2"/>
       </w:pPr>
-      <w:bookmarkStart w:id="13" w:name="_Toc236778368"/>
+      <w:bookmarkStart w:id="16" w:name="_Toc237516086"/>
       <w:r>
         <w:lastRenderedPageBreak/>
         <w:t>6.</w:t>
@@ -4826,7 +4990,7 @@
       <w:r>
         <w:t>t State Assessment</w:t>
       </w:r>
-      <w:bookmarkEnd w:id="13"/>
+      <w:bookmarkEnd w:id="16"/>
     </w:p>
     <w:p>
       <w:pPr>
@@ -4847,11 +5011,11 @@
       <w:pPr>
         <w:pStyle w:val="Heading3"/>
       </w:pPr>
-      <w:bookmarkStart w:id="14" w:name="_Toc236778369"/>
+      <w:bookmarkStart w:id="17" w:name="_Toc237516087"/>
       <w:r>
         <w:t>6.1 Current Environment</w:t>
       </w:r>
-      <w:bookmarkEnd w:id="14"/>
+      <w:bookmarkEnd w:id="17"/>
     </w:p>
     <w:p>
       <w:r>
@@ -4887,12 +5051,11 @@
       <w:pPr>
         <w:pStyle w:val="Heading3"/>
       </w:pPr>
-      <w:bookmarkStart w:id="15" w:name="_Toc236778370"/>
+      <w:bookmarkStart w:id="18" w:name="_Toc237516088"/>
       <w:r>
         <w:t>6.2 Current Processes</w:t>
       </w:r>
-      <w:bookmarkStart w:id="16" w:name="_Toc236778371"/>
-      <w:bookmarkEnd w:id="15"/>
+      <w:bookmarkEnd w:id="18"/>
     </w:p>
     <w:p>
       <w:r>
@@ -5121,10 +5284,11 @@
       <w:pPr>
         <w:pStyle w:val="Heading3"/>
       </w:pPr>
+      <w:bookmarkStart w:id="19" w:name="_Toc237516089"/>
       <w:r>
         <w:t>6.3 Current Challenges</w:t>
       </w:r>
-      <w:bookmarkEnd w:id="16"/>
+      <w:bookmarkEnd w:id="19"/>
     </w:p>
     <w:p>
       <w:r>
@@ -5297,22 +5461,22 @@
       <w:pPr>
         <w:pStyle w:val="Heading2"/>
       </w:pPr>
-      <w:bookmarkStart w:id="17" w:name="_Toc236778372"/>
+      <w:bookmarkStart w:id="20" w:name="_Toc237516090"/>
       <w:r>
         <w:lastRenderedPageBreak/>
         <w:t>7. Proposed Process</w:t>
       </w:r>
-      <w:bookmarkEnd w:id="17"/>
+      <w:bookmarkEnd w:id="20"/>
     </w:p>
     <w:p>
       <w:pPr>
         <w:pStyle w:val="Heading3"/>
       </w:pPr>
-      <w:bookmarkStart w:id="18" w:name="_Toc236778373"/>
+      <w:bookmarkStart w:id="21" w:name="_Toc237516091"/>
       <w:r>
         <w:t>7.1 Delivery Approach</w:t>
       </w:r>
-      <w:bookmarkEnd w:id="18"/>
+      <w:bookmarkEnd w:id="21"/>
     </w:p>
     <w:p>
       <w:r>
@@ -5434,11 +5598,11 @@
           <w:numId w:val="22"/>
         </w:numPr>
       </w:pPr>
-      <w:bookmarkStart w:id="19" w:name="_Toc236778374"/>
+      <w:bookmarkStart w:id="22" w:name="_Toc237516092"/>
       <w:r>
         <w:t>Proposed project lifecycle</w:t>
       </w:r>
-      <w:bookmarkEnd w:id="19"/>
+      <w:bookmarkEnd w:id="22"/>
     </w:p>
     <w:p>
       <w:r>
@@ -6290,11 +6454,11 @@
       <w:pPr>
         <w:pStyle w:val="Heading3"/>
       </w:pPr>
-      <w:bookmarkStart w:id="20" w:name="_Toc236778375"/>
+      <w:bookmarkStart w:id="23" w:name="_Toc237516093"/>
       <w:r>
         <w:t>7.3 Governance</w:t>
       </w:r>
-      <w:bookmarkEnd w:id="20"/>
+      <w:bookmarkEnd w:id="23"/>
     </w:p>
     <w:p>
       <w:r>
@@ -6995,12 +7159,12 @@
       <w:pPr>
         <w:pStyle w:val="Heading2"/>
       </w:pPr>
-      <w:bookmarkStart w:id="21" w:name="_Toc236778376"/>
+      <w:bookmarkStart w:id="24" w:name="_Toc237516094"/>
       <w:r>
         <w:lastRenderedPageBreak/>
         <w:t>8. Functional Requirements</w:t>
       </w:r>
-      <w:bookmarkEnd w:id="21"/>
+      <w:bookmarkEnd w:id="24"/>
     </w:p>
     <w:p>
       <w:pPr>
@@ -11155,12 +11319,12 @@
       <w:pPr>
         <w:pStyle w:val="Heading2"/>
       </w:pPr>
-      <w:bookmarkStart w:id="22" w:name="_Toc236778377"/>
+      <w:bookmarkStart w:id="25" w:name="_Toc237516095"/>
       <w:r>
         <w:lastRenderedPageBreak/>
         <w:t>9. Non-Functional Requirements</w:t>
       </w:r>
-      <w:bookmarkEnd w:id="22"/>
+      <w:bookmarkEnd w:id="25"/>
     </w:p>
     <w:p>
       <w:r>
@@ -13239,12 +13403,12 @@
           <w:numId w:val="12"/>
         </w:numPr>
       </w:pPr>
-      <w:bookmarkStart w:id="23" w:name="_Toc236778378"/>
+      <w:bookmarkStart w:id="26" w:name="_Toc237516096"/>
       <w:r>
         <w:lastRenderedPageBreak/>
         <w:t>Key Stakeholders</w:t>
       </w:r>
-      <w:bookmarkEnd w:id="23"/>
+      <w:bookmarkEnd w:id="26"/>
     </w:p>
     <w:p>
       <w:r>
@@ -13828,12 +13992,12 @@
           <w:numId w:val="13"/>
         </w:numPr>
       </w:pPr>
-      <w:bookmarkStart w:id="24" w:name="_Toc236778379"/>
+      <w:bookmarkStart w:id="27" w:name="_Toc237516097"/>
       <w:r>
         <w:lastRenderedPageBreak/>
         <w:t>Assumptions</w:t>
       </w:r>
-      <w:bookmarkEnd w:id="24"/>
+      <w:bookmarkEnd w:id="27"/>
     </w:p>
     <w:p>
       <w:r>
@@ -14427,11 +14591,11 @@
           <w:numId w:val="14"/>
         </w:numPr>
       </w:pPr>
-      <w:bookmarkStart w:id="25" w:name="_Toc236778380"/>
+      <w:bookmarkStart w:id="28" w:name="_Toc237516098"/>
       <w:r>
         <w:t>Constraints</w:t>
       </w:r>
-      <w:bookmarkEnd w:id="25"/>
+      <w:bookmarkEnd w:id="28"/>
     </w:p>
     <w:p>
       <w:r>
@@ -14952,15 +15116,15 @@
           <w:numId w:val="15"/>
         </w:numPr>
       </w:pPr>
-      <w:bookmarkStart w:id="26" w:name="_Toc236778381"/>
+      <w:bookmarkStart w:id="29" w:name="_Toc237516099"/>
       <w:r>
         <w:lastRenderedPageBreak/>
         <w:t>Risk</w:t>
       </w:r>
-      <w:bookmarkEnd w:id="26"/>
       <w:r>
         <w:t>s</w:t>
       </w:r>
+      <w:bookmarkEnd w:id="29"/>
     </w:p>
     <w:p>
       <w:r>
@@ -16102,11 +16266,11 @@
           <w:numId w:val="14"/>
         </w:numPr>
       </w:pPr>
-      <w:bookmarkStart w:id="27" w:name="_Toc236778382"/>
+      <w:bookmarkStart w:id="30" w:name="_Toc237516100"/>
       <w:r>
         <w:t>Success Criteria</w:t>
       </w:r>
-      <w:bookmarkEnd w:id="27"/>
+      <w:bookmarkEnd w:id="30"/>
     </w:p>
     <w:p>
       <w:r>
@@ -16883,12 +17047,12 @@
           <w:numId w:val="14"/>
         </w:numPr>
       </w:pPr>
-      <w:bookmarkStart w:id="28" w:name="_Toc236778383"/>
+      <w:bookmarkStart w:id="31" w:name="_Toc237516101"/>
       <w:r>
         <w:lastRenderedPageBreak/>
         <w:t>Approval</w:t>
       </w:r>
-      <w:bookmarkEnd w:id="28"/>
+      <w:bookmarkEnd w:id="31"/>
     </w:p>
     <w:p>
       <w:r>
@@ -16924,9 +17088,11 @@
       <w:pPr>
         <w:pStyle w:val="Heading3"/>
       </w:pPr>
+      <w:bookmarkStart w:id="32" w:name="_Toc237516102"/>
       <w:r>
         <w:t>Approval Sign-Off</w:t>
       </w:r>
+      <w:bookmarkEnd w:id="32"/>
     </w:p>
     <w:tbl>
       <w:tblPr>
@@ -17220,12 +17386,14 @@
       <w:pPr>
         <w:pStyle w:val="Heading3"/>
       </w:pPr>
+      <w:bookmarkStart w:id="33" w:name="_Toc237516103"/>
       <w:r>
         <w:t>B</w:t>
       </w:r>
       <w:r>
         <w:t>aseline</w:t>
       </w:r>
+      <w:bookmarkEnd w:id="33"/>
     </w:p>
     <w:p>
       <w:r>
@@ -17287,14 +17455,14 @@
       <w:pPr>
         <w:pStyle w:val="Heading2"/>
       </w:pPr>
-      <w:bookmarkStart w:id="29" w:name="_Toc236778384"/>
+      <w:bookmarkStart w:id="34" w:name="_Toc237516104"/>
       <w:r>
         <w:t xml:space="preserve">Appendix 1 – </w:t>
       </w:r>
       <w:r>
         <w:t>Glossary</w:t>
       </w:r>
-      <w:bookmarkEnd w:id="29"/>
+      <w:bookmarkEnd w:id="34"/>
     </w:p>
     <w:tbl>
       <w:tblPr>
@@ -17603,7 +17771,7 @@
       <w:pPr>
         <w:pStyle w:val="Heading2"/>
       </w:pPr>
-      <w:bookmarkStart w:id="30" w:name="_Toc236778385"/>
+      <w:bookmarkStart w:id="35" w:name="_Toc237516105"/>
       <w:r>
         <w:lastRenderedPageBreak/>
         <w:t xml:space="preserve">Appendix 2 - </w:t>
@@ -17611,7 +17779,7 @@
       <w:r>
         <w:t>Priority Table</w:t>
       </w:r>
-      <w:bookmarkEnd w:id="30"/>
+      <w:bookmarkEnd w:id="35"/>
     </w:p>
     <w:tbl>
       <w:tblPr>
@@ -17864,7 +18032,6 @@
         <w:docPartUnique/>
       </w:docPartObj>
     </w:sdtPr>
-    <w:sdtEndPr/>
     <w:sdtContent>
       <w:sdt>
         <w:sdtPr>
@@ -17874,7 +18041,6 @@
             <w:docPartUnique/>
           </w:docPartObj>
         </w:sdtPr>
-        <w:sdtEndPr/>
         <w:sdtContent>
           <w:p>
             <w:pPr>

</xml_diff>